<commit_message>
Simplify portfolio and feature Daraz and Beeda
</commit_message>
<xml_diff>
--- a/resume/MD_Jahirul_Islam_Resume.docx
+++ b/resume/MD_Jahirul_Islam_Resume.docx
@@ -445,6 +445,27 @@
           <w:rPr>
             <w:color w:val="000000"/>
           </w:rPr>
+          <w:t>Daraz | Alibaba Group | E-commerce</w:t>
+        </w:r>
+      </w:hyperlink>
+    </w:p>
+    <w:p>
+      <w:pPr>
+        <w:keepLines/>
+      </w:pPr>
+      <w:r>
+        <w:t>Contributed to the Daraz iOS shopping app as a Senior Software Engineer. Developed and optimized shopping features, supported data-informed product decisions, and proposed system design improvements to simplify delivery.</w:t>
+      </w:r>
+    </w:p>
+    <w:p>
+      <w:pPr>
+        <w:pStyle w:val="Heading2"/>
+      </w:pPr>
+      <w:hyperlink r:id="rId14">
+        <w:r>
+          <w:rPr>
+            <w:color w:val="000000"/>
+          </w:rPr>
           <w:t>Expense Packet | Independent iOS Product</w:t>
         </w:r>
       </w:hyperlink>
@@ -461,7 +482,7 @@
       <w:pPr>
         <w:pStyle w:val="Heading2"/>
       </w:pPr>
-      <w:hyperlink r:id="rId14">
+      <w:hyperlink r:id="rId15">
         <w:r>
           <w:rPr>
             <w:color w:val="000000"/>
@@ -482,7 +503,7 @@
       <w:pPr>
         <w:pStyle w:val="Heading2"/>
       </w:pPr>
-      <w:hyperlink r:id="rId15">
+      <w:hyperlink r:id="rId16">
         <w:r>
           <w:rPr>
             <w:color w:val="000000"/>
@@ -503,7 +524,7 @@
       <w:pPr>
         <w:pStyle w:val="Heading2"/>
       </w:pPr>
-      <w:hyperlink r:id="rId16">
+      <w:hyperlink r:id="rId17">
         <w:r>
           <w:rPr>
             <w:color w:val="000000"/>
@@ -518,27 +539,6 @@
       </w:pPr>
       <w:r>
         <w:t>Redesigned the application interface and user experience for a food delivery product, contributing to a 20% increase in orders.</w:t>
-      </w:r>
-    </w:p>
-    <w:p>
-      <w:pPr>
-        <w:pStyle w:val="Heading2"/>
-      </w:pPr>
-      <w:hyperlink r:id="rId17">
-        <w:r>
-          <w:rPr>
-            <w:color w:val="000000"/>
-          </w:rPr>
-          <w:t>Medico | Telemedicine</w:t>
-        </w:r>
-      </w:hyperlink>
-    </w:p>
-    <w:p>
-      <w:pPr>
-        <w:keepLines/>
-      </w:pPr>
-      <w:r>
-        <w:t>Designed and developed a telemedicine application, drawing on real-time messaging and video communication experience.</w:t>
       </w:r>
     </w:p>
     <w:p>

</xml_diff>